<commit_message>
Fix Apryse application: correct fabricated tool gap, record real skills
Corrected a real error: the cover letter and match report claimed Josh
lacked Outreach/Dooly/ZoomInfo experience, based only on their absence
from the master profile, not on anything he'd confirmed. Josh has real,
direct experience with Outreach and ZoomInfo. Recorded both in the
master profile's Tools & Platforms bank, added a standing rule to
confirm before asserting a gap rather than inferring one from an
incomplete document, updated the Apryse resume/cover letter/match
report/score (66 -> 70) accordingly, and removed the stale PDF that
still carried the incorrect claim.

Also records a new standing preference: cover letters are delivered as
copy-paste text in the chat by default, not rendered as PDF/DOCX, unless
a posting specifically requires an uploaded file.
</commit_message>
<xml_diff>
--- a/applications/apryse-account-manager-commercial/Rotenberg Resume - Apryse - Account Manager, Commercial.docx
+++ b/applications/apryse-account-manager-commercial/Rotenberg Resume - Apryse - Account Manager, Commercial.docx
@@ -664,7 +664,7 @@
           <w:i w:val="0"/>
           <w:color w:val="1A1A1A"/>
         </w:rPr>
-        <w:t xml:space="preserve">CRM &amp; Tools:  </w:t>
+        <w:t xml:space="preserve">CRM &amp; Prospecting Tools:  </w:t>
       </w:r>
       <w:r>
         <w:rPr>
@@ -673,7 +673,7 @@
           <w:i w:val="0"/>
           <w:color w:val="1A1A1A"/>
         </w:rPr>
-        <w:t>Salesforce, HubSpot, Pipeline Automation</w:t>
+        <w:t>Salesforce, Outreach, ZoomInfo, HubSpot, Pipeline Automation</w:t>
       </w:r>
     </w:p>
     <w:p>

</xml_diff>